<commit_message>
I have finished cleaning treatment_cleaned table
</commit_message>
<xml_diff>
--- a/Hospital Management Dataset.docx
+++ b/Hospital Management Dataset.docx
@@ -1,6 +1,6 @@
 
 <file path=word/document.xml><?xml version="1.0" encoding="utf-8"?>
-<w:document xmlns:wpc="http://schemas.microsoft.com/office/word/2010/wordprocessingCanvas" xmlns:cx="http://schemas.microsoft.com/office/drawing/2014/chartex" xmlns:cx1="http://schemas.microsoft.com/office/drawing/2015/9/8/chartex" xmlns:cx2="http://schemas.microsoft.com/office/drawing/2015/10/21/chartex" xmlns:cx3="http://schemas.microsoft.com/office/drawing/2016/5/9/chartex" xmlns:cx4="http://schemas.microsoft.com/office/drawing/2016/5/10/chartex" xmlns:cx5="http://schemas.microsoft.com/office/drawing/2016/5/11/chartex" xmlns:cx6="http://schemas.microsoft.com/office/drawing/2016/5/12/chartex" xmlns:cx7="http://schemas.microsoft.com/office/drawing/2016/5/13/chartex" xmlns:cx8="http://schemas.microsoft.com/office/drawing/2016/5/14/chartex" xmlns:mc="http://schemas.openxmlformats.org/markup-compatibility/2006" xmlns:aink="http://schemas.microsoft.com/office/drawing/2016/ink" xmlns:am3d="http://schemas.microsoft.com/office/drawing/2017/model3d" xmlns:o="urn:schemas-microsoft-com:office:office" xmlns:oel="http://schemas.microsoft.com/office/2019/extlst" xmlns:r="http://schemas.openxmlformats.org/officeDocument/2006/relationships" xmlns:m="http://schemas.openxmlformats.org/officeDocument/2006/math" xmlns:v="urn:schemas-microsoft-com:vml" xmlns:wp14="http://schemas.microsoft.com/office/word/2010/wordprocessingDrawing" xmlns:wp="http://schemas.openxmlformats.org/drawingml/2006/wordprocessingDrawing" xmlns:w10="urn:schemas-microsoft-com:office:word" xmlns:w="http://schemas.openxmlformats.org/wordprocessingml/2006/main" xmlns:w14="http://schemas.microsoft.com/office/word/2010/wordml" xmlns:w15="http://schemas.microsoft.com/office/word/2012/wordml" xmlns:w16cex="http://schemas.microsoft.com/office/word/2018/wordml/cex" xmlns:w16cid="http://schemas.microsoft.com/office/word/2016/wordml/cid" xmlns:w16="http://schemas.microsoft.com/office/word/2018/wordml" xmlns:w16du="http://schemas.microsoft.com/office/word/2023/wordml/word16du" xmlns:w16sdtdh="http://schemas.microsoft.com/office/word/2020/wordml/sdtdatahash" xmlns:w16sdtfl="http://schemas.microsoft.com/office/word/2024/wordml/sdtformatlock" xmlns:w16se="http://schemas.microsoft.com/office/word/2015/wordml/symex" xmlns:wpg="http://schemas.microsoft.com/office/word/2010/wordprocessingGroup" xmlns:wpi="http://schemas.microsoft.com/office/word/2010/wordprocessingInk" xmlns:wne="http://schemas.microsoft.com/office/word/2006/wordml" xmlns:wps="http://schemas.microsoft.com/office/word/2010/wordprocessingShape" mc:Ignorable="w14 w15 w16se w16cid w16 w16cex w16sdtdh w16sdtfl w16du wp14">
+<w:document xmlns:wpc="http://schemas.microsoft.com/office/word/2010/wordprocessingCanvas" xmlns:cx="http://schemas.microsoft.com/office/drawing/2014/chartex" xmlns:cx1="http://schemas.microsoft.com/office/drawing/2015/9/8/chartex" xmlns:cx2="http://schemas.microsoft.com/office/drawing/2015/10/21/chartex" xmlns:cx3="http://schemas.microsoft.com/office/drawing/2016/5/9/chartex" xmlns:cx4="http://schemas.microsoft.com/office/drawing/2016/5/10/chartex" xmlns:cx5="http://schemas.microsoft.com/office/drawing/2016/5/11/chartex" xmlns:cx6="http://schemas.microsoft.com/office/drawing/2016/5/12/chartex" xmlns:cx7="http://schemas.microsoft.com/office/drawing/2016/5/13/chartex" xmlns:cx8="http://schemas.microsoft.com/office/drawing/2016/5/14/chartex" xmlns:mc="http://schemas.openxmlformats.org/markup-compatibility/2006" xmlns:aink="http://schemas.microsoft.com/office/drawing/2016/ink" xmlns:am3d="http://schemas.microsoft.com/office/drawing/2017/model3d" xmlns:o="urn:schemas-microsoft-com:office:office" xmlns:oel="http://schemas.microsoft.com/office/2019/extlst" xmlns:r="http://schemas.openxmlformats.org/officeDocument/2006/relationships" xmlns:m="http://schemas.openxmlformats.org/officeDocument/2006/math" xmlns:v="urn:schemas-microsoft-com:vml" xmlns:wp14="http://schemas.microsoft.com/office/word/2010/wordprocessingDrawing" xmlns:wp="http://schemas.openxmlformats.org/drawingml/2006/wordprocessingDrawing" xmlns:w10="urn:schemas-microsoft-com:office:word" xmlns:w="http://schemas.openxmlformats.org/wordprocessingml/2006/main" xmlns:w14="http://schemas.microsoft.com/office/word/2010/wordml" xmlns:w15="http://schemas.microsoft.com/office/word/2012/wordml" xmlns:w16cei="http://schemas.microsoft.com/office/word/2026/wordml/cei" xmlns:w16cex="http://schemas.microsoft.com/office/word/2018/wordml/cex" xmlns:w16cid="http://schemas.microsoft.com/office/word/2016/wordml/cid" xmlns:w16="http://schemas.microsoft.com/office/word/2018/wordml" xmlns:w16du="http://schemas.microsoft.com/office/word/2023/wordml/word16du" xmlns:w16sdtdh="http://schemas.microsoft.com/office/word/2020/wordml/sdtdatahash" xmlns:w16sdtfl="http://schemas.microsoft.com/office/word/2024/wordml/sdtformatlock" xmlns:w16se="http://schemas.microsoft.com/office/word/2015/wordml/symex" xmlns:wpg="http://schemas.microsoft.com/office/word/2010/wordprocessingGroup" xmlns:wpi="http://schemas.microsoft.com/office/word/2010/wordprocessingInk" xmlns:wne="http://schemas.microsoft.com/office/word/2006/wordml" xmlns:wps="http://schemas.microsoft.com/office/word/2010/wordprocessingShape" mc:Ignorable="w14 w15 w16se w16cid w16 w16cex w16sdtdh w16sdtfl w16du wp14">
   <w:body>
     <w:p>
       <w:r>
@@ -734,6 +734,360 @@
       </w:tr>
     </w:tbl>
     <w:p/>
+    <w:p>
+      <w:r>
+        <w:t>Document summary for cleaned patient data</w:t>
+      </w:r>
+    </w:p>
+    <w:tbl>
+      <w:tblPr>
+        <w:tblStyle w:val="TableGrid"/>
+        <w:tblW w:w="0" w:type="auto"/>
+        <w:tblLook w:val="04A0" w:firstRow="1" w:lastRow="0" w:firstColumn="1" w:lastColumn="0" w:noHBand="0" w:noVBand="1"/>
+      </w:tblPr>
+      <w:tblGrid>
+        <w:gridCol w:w="1525"/>
+        <w:gridCol w:w="2700"/>
+        <w:gridCol w:w="1710"/>
+        <w:gridCol w:w="3415"/>
+      </w:tblGrid>
+      <w:tr>
+        <w:tc>
+          <w:tcPr>
+            <w:tcW w:w="1525" w:type="dxa"/>
+          </w:tcPr>
+          <w:p>
+            <w:r>
+              <w:t xml:space="preserve">Step </w:t>
+            </w:r>
+          </w:p>
+        </w:tc>
+        <w:tc>
+          <w:tcPr>
+            <w:tcW w:w="2700" w:type="dxa"/>
+          </w:tcPr>
+          <w:p>
+            <w:r>
+              <w:t xml:space="preserve">Check </w:t>
+            </w:r>
+          </w:p>
+        </w:tc>
+        <w:tc>
+          <w:tcPr>
+            <w:tcW w:w="1710" w:type="dxa"/>
+          </w:tcPr>
+          <w:p>
+            <w:r>
+              <w:t>Result</w:t>
+            </w:r>
+          </w:p>
+        </w:tc>
+        <w:tc>
+          <w:tcPr>
+            <w:tcW w:w="3415" w:type="dxa"/>
+          </w:tcPr>
+          <w:p>
+            <w:r>
+              <w:t>Action</w:t>
+            </w:r>
+          </w:p>
+        </w:tc>
+      </w:tr>
+      <w:tr>
+        <w:tc>
+          <w:tcPr>
+            <w:tcW w:w="1525" w:type="dxa"/>
+          </w:tcPr>
+          <w:p>
+            <w:r>
+              <w:t>1</w:t>
+            </w:r>
+          </w:p>
+        </w:tc>
+        <w:tc>
+          <w:tcPr>
+            <w:tcW w:w="2700" w:type="dxa"/>
+          </w:tcPr>
+          <w:p>
+            <w:r>
+              <w:t>Duplicate Patient IDs</w:t>
+            </w:r>
+          </w:p>
+        </w:tc>
+        <w:tc>
+          <w:tcPr>
+            <w:tcW w:w="1710" w:type="dxa"/>
+          </w:tcPr>
+          <w:p>
+            <w:r>
+              <w:t>0</w:t>
+            </w:r>
+          </w:p>
+        </w:tc>
+        <w:tc>
+          <w:tcPr>
+            <w:tcW w:w="3415" w:type="dxa"/>
+          </w:tcPr>
+          <w:p>
+            <w:r>
+              <w:t>None</w:t>
+            </w:r>
+          </w:p>
+        </w:tc>
+      </w:tr>
+      <w:tr>
+        <w:tc>
+          <w:tcPr>
+            <w:tcW w:w="1525" w:type="dxa"/>
+          </w:tcPr>
+          <w:p>
+            <w:r>
+              <w:t>2</w:t>
+            </w:r>
+          </w:p>
+        </w:tc>
+        <w:tc>
+          <w:tcPr>
+            <w:tcW w:w="2700" w:type="dxa"/>
+          </w:tcPr>
+          <w:p>
+            <w:r>
+              <w:t>Missing Values</w:t>
+            </w:r>
+          </w:p>
+        </w:tc>
+        <w:tc>
+          <w:tcPr>
+            <w:tcW w:w="1710" w:type="dxa"/>
+          </w:tcPr>
+          <w:p>
+            <w:r>
+              <w:t>0</w:t>
+            </w:r>
+          </w:p>
+        </w:tc>
+        <w:tc>
+          <w:tcPr>
+            <w:tcW w:w="3415" w:type="dxa"/>
+          </w:tcPr>
+          <w:p>
+            <w:r>
+              <w:t>None</w:t>
+            </w:r>
+          </w:p>
+        </w:tc>
+      </w:tr>
+      <w:tr>
+        <w:tc>
+          <w:tcPr>
+            <w:tcW w:w="1525" w:type="dxa"/>
+          </w:tcPr>
+          <w:p>
+            <w:r>
+              <w:t>3</w:t>
+            </w:r>
+          </w:p>
+        </w:tc>
+        <w:tc>
+          <w:tcPr>
+            <w:tcW w:w="2700" w:type="dxa"/>
+          </w:tcPr>
+          <w:p>
+            <w:r>
+              <w:t>Blank Strings</w:t>
+            </w:r>
+          </w:p>
+        </w:tc>
+        <w:tc>
+          <w:tcPr>
+            <w:tcW w:w="1710" w:type="dxa"/>
+          </w:tcPr>
+          <w:p>
+            <w:r>
+              <w:t>0</w:t>
+            </w:r>
+          </w:p>
+        </w:tc>
+        <w:tc>
+          <w:tcPr>
+            <w:tcW w:w="3415" w:type="dxa"/>
+          </w:tcPr>
+          <w:p>
+            <w:r>
+              <w:t>None</w:t>
+            </w:r>
+          </w:p>
+        </w:tc>
+      </w:tr>
+      <w:tr>
+        <w:tc>
+          <w:tcPr>
+            <w:tcW w:w="1525" w:type="dxa"/>
+          </w:tcPr>
+          <w:p>
+            <w:r>
+              <w:t>4</w:t>
+            </w:r>
+          </w:p>
+        </w:tc>
+        <w:tc>
+          <w:tcPr>
+            <w:tcW w:w="2700" w:type="dxa"/>
+          </w:tcPr>
+          <w:p>
+            <w:r>
+              <w:t>Duplicate Emails</w:t>
+            </w:r>
+          </w:p>
+        </w:tc>
+        <w:tc>
+          <w:tcPr>
+            <w:tcW w:w="1710" w:type="dxa"/>
+          </w:tcPr>
+          <w:p>
+            <w:r>
+              <w:t>0</w:t>
+            </w:r>
+          </w:p>
+        </w:tc>
+        <w:tc>
+          <w:tcPr>
+            <w:tcW w:w="3415" w:type="dxa"/>
+          </w:tcPr>
+          <w:p>
+            <w:r>
+              <w:t>None</w:t>
+            </w:r>
+          </w:p>
+        </w:tc>
+      </w:tr>
+      <w:tr>
+        <w:tc>
+          <w:tcPr>
+            <w:tcW w:w="1525" w:type="dxa"/>
+          </w:tcPr>
+          <w:p>
+            <w:r>
+              <w:t>5</w:t>
+            </w:r>
+          </w:p>
+        </w:tc>
+        <w:tc>
+          <w:tcPr>
+            <w:tcW w:w="2700" w:type="dxa"/>
+          </w:tcPr>
+          <w:p>
+            <w:r>
+              <w:t>Gender Standardization</w:t>
+            </w:r>
+          </w:p>
+        </w:tc>
+        <w:tc>
+          <w:tcPr>
+            <w:tcW w:w="1710" w:type="dxa"/>
+          </w:tcPr>
+          <w:p>
+            <w:r>
+              <w:t>M/F Found</w:t>
+            </w:r>
+          </w:p>
+        </w:tc>
+        <w:tc>
+          <w:tcPr>
+            <w:tcW w:w="3415" w:type="dxa"/>
+          </w:tcPr>
+          <w:p>
+            <w:r>
+              <w:t>Converted to Male and Female</w:t>
+            </w:r>
+          </w:p>
+        </w:tc>
+      </w:tr>
+      <w:tr>
+        <w:tc>
+          <w:tcPr>
+            <w:tcW w:w="1525" w:type="dxa"/>
+          </w:tcPr>
+          <w:p>
+            <w:r>
+              <w:t>6</w:t>
+            </w:r>
+          </w:p>
+        </w:tc>
+        <w:tc>
+          <w:tcPr>
+            <w:tcW w:w="2700" w:type="dxa"/>
+          </w:tcPr>
+          <w:p>
+            <w:r>
+              <w:t xml:space="preserve">Invalid Dates </w:t>
+            </w:r>
+          </w:p>
+        </w:tc>
+        <w:tc>
+          <w:tcPr>
+            <w:tcW w:w="1710" w:type="dxa"/>
+          </w:tcPr>
+          <w:p>
+            <w:r>
+              <w:t>0</w:t>
+            </w:r>
+          </w:p>
+        </w:tc>
+        <w:tc>
+          <w:tcPr>
+            <w:tcW w:w="3415" w:type="dxa"/>
+          </w:tcPr>
+          <w:p>
+            <w:r>
+              <w:t>None</w:t>
+            </w:r>
+          </w:p>
+        </w:tc>
+      </w:tr>
+      <w:tr>
+        <w:tc>
+          <w:tcPr>
+            <w:tcW w:w="1525" w:type="dxa"/>
+          </w:tcPr>
+          <w:p>
+            <w:r>
+              <w:t>7</w:t>
+            </w:r>
+          </w:p>
+        </w:tc>
+        <w:tc>
+          <w:tcPr>
+            <w:tcW w:w="2700" w:type="dxa"/>
+          </w:tcPr>
+          <w:p>
+            <w:r>
+              <w:t>Invalid Emails</w:t>
+            </w:r>
+          </w:p>
+        </w:tc>
+        <w:tc>
+          <w:tcPr>
+            <w:tcW w:w="1710" w:type="dxa"/>
+          </w:tcPr>
+          <w:p>
+            <w:r>
+              <w:t>0</w:t>
+            </w:r>
+          </w:p>
+        </w:tc>
+        <w:tc>
+          <w:tcPr>
+            <w:tcW w:w="3415" w:type="dxa"/>
+          </w:tcPr>
+          <w:p>
+            <w:r>
+              <w:t>None</w:t>
+            </w:r>
+          </w:p>
+        </w:tc>
+      </w:tr>
+    </w:tbl>
     <w:p/>
     <w:p/>
     <w:sectPr>
@@ -1349,6 +1703,7 @@
   <w:style w:type="character" w:default="1" w:styleId="DefaultParagraphFont">
     <w:name w:val="Default Paragraph Font"/>
     <w:uiPriority w:val="1"/>
+    <w:semiHidden/>
     <w:unhideWhenUsed/>
   </w:style>
   <w:style w:type="table" w:default="1" w:styleId="TableNormal">

</xml_diff>